<commit_message>
Update final report with complete project link
</commit_message>
<xml_diff>
--- a/docs/report/软件测试与维护大作业报告_五人联合版.docx
+++ b/docs/report/软件测试与维护大作业报告_五人联合版.docx
@@ -23406,15 +23406,32 @@
     </w:p>
     <w:p>
       <w:pPr>
+        <w:ind w:firstLine="0"/>
         <w:rPr>
           <w:rFonts w:hint="eastAsia"/>
         </w:rPr>
       </w:pPr>
       <w:r>
-        <w:rPr>
-          <w:rFonts w:cs="宋体"/>
-        </w:rPr>
-        <w:t>AIOps 集成代码作为小组最终交接包保存，当前未单独公开仓库；报告中的实时运行证据来自交接包内的runtime_data、runtime_outputs、Agent 报告和 Dashboard 截图。</w:t>
+        <w:t>项目完整展示仓库：</w:t>
+      </w:r>
+      <w:hyperlink r:id="rId28">
+        <w:r>
+          <w:rPr>
+            <w:color w:val="000000"/>
+            <w:u w:val="single"/>
+          </w:rPr>
+          <w:t>https://github.com/sevenpeek/software-testing-aiops-final-project</w:t>
+        </w:r>
+      </w:hyperlink>
+    </w:p>
+    <w:p>
+      <w:pPr>
+        <w:rPr>
+          <w:rFonts w:hint="eastAsia"/>
+        </w:rPr>
+      </w:pPr>
+      <w:r>
+        <w:t>AIOps 集成代码、runtime_data、runtime_outputs、Agent 报告和 Dashboard 运行证据已统一收录于项目完整展示仓库。</w:t>
       </w:r>
     </w:p>
     <w:p>

</xml_diff>